<commit_message>
docs(learning): Drive export complete — 3 docs to 2026 DWS6 folder
Exported this session's field note (full text), a "Session Changes"
addendum (the actual new/changed text from the handbook v1.11, roadmap
v1.7.1, and thesis §10.17/§14.48 additions), and the 5-language blog
post text to Google Drive. Full 4-file thesis set (up to ~800KB each)
deliberately not re-uploaded whole -- the repo remains source of truth
per the Productivity Stack Rule; only the new increments were exported.
Also adds fresh Learn/ renders for the handbook v1.11 and roadmap v1.7.1
(prior Learn/ copies were stale at v1.81 / v1.1.0).

Co-Authored-By: Claude Sonnet 5 <noreply@anthropic.com>
Claude-Session: https://claude.ai/code/session_01BrrMhC2J3dkYkihag1xN19
</commit_message>
<xml_diff>
--- a/Learn/2026-08-06-arvonluonnin-ajurit-blog-launch-and-text-provenance.docx
+++ b/Learn/2026-08-06-arvonluonnin-ajurit-blog-launch-and-text-provenance.docx
@@ -897,7 +897,7 @@
         <w:t xml:space="preserve"> </w:t>
       </w:r>
       <w:r>
-        <w:t xml:space="preserve">not performed this session — offered, not yet done. Say the word and this note plus the thesis renders can be pushed to the</w:t>
+        <w:t xml:space="preserve">✅ Done — 3 Google Docs in the</w:t>
       </w:r>
       <w:r>
         <w:t xml:space="preserve"> </w:t>
@@ -912,7 +912,25 @@
         <w:t xml:space="preserve"> </w:t>
       </w:r>
       <w:r>
-        <w:t xml:space="preserve">Drive folder.</w:t>
+        <w:t xml:space="preserve">Drive folder: this field note in full; a</w:t>
+      </w:r>
+      <w:r>
+        <w:t xml:space="preserve"> </w:t>
+      </w:r>
+      <w:r>
+        <w:t xml:space="preserve">“</w:t>
+      </w:r>
+      <w:r>
+        <w:t xml:space="preserve">Session Changes</w:t>
+      </w:r>
+      <w:r>
+        <w:t xml:space="preserve">”</w:t>
+      </w:r>
+      <w:r>
+        <w:t xml:space="preserve"> </w:t>
+      </w:r>
+      <w:r>
+        <w:t xml:space="preserve">doc with the actual new/changed text (handbook v1.11 pointer, roadmap v1.7.1 changelog, thesis §10.17/§14.48 in full — the 4 full thesis documents themselves, up to ~800KB each, were not re-uploaded whole; the repo remains their source of truth); and the 5-language blog post text in full.</w:t>
       </w:r>
     </w:p>
     <w:p>

</xml_diff>